<commit_message>
manifesto: substitui pelo v2 (EN) — mesma narrativa, números 626.8M atualizados
🤖 Generated with [Claude Code](https://claude.com/claude-code)
</commit_message>
<xml_diff>
--- a/manifesto-nuxs-en.docx
+++ b/manifesto-nuxs-en.docx
@@ -27,7 +27,7 @@
           <w:i w:val="0"/>
           <w:sz w:val="24"/>
         </w:rPr>
-        <w:t>Every new technology creates its own unit of value. Years ago we saw this with bitcoin and the economy that formed around it. Today we are seeing it happen again — and this time the unit of value is the token, the currency of the AI era, used as the unit of cost and measurement for the intelligence that powers agents. However — and I am sorry to say this — the way most people use their tokens is pure waste.</w:t>
+        <w:t>Every new technology creates its own unit of value. Years ago we saw this with bitcoin and the economy that formed around it. Today we are seeing it happen again — and this time the unit of value is the token, the currency of the AI era, used as the unit of cost and measurement for the intelligence that powers agents. However, a large share of those tokens is spent on something nobody chose to buy: redundancy.</w:t>
       </w:r>
     </w:p>
     <w:p>
@@ -125,7 +125,7 @@
           <w:i w:val="0"/>
           <w:sz w:val="24"/>
         </w:rPr>
-        <w:t>The team embraced the idea and, to my surprise, in a short time they became dependent on the office's agents. In less than two weeks we accelerated months of work. And that is not even an exaggeration.</w:t>
+        <w:t>The team embraced the idea and, to my surprise, in a short time they became dependent on the office's agents. In less than two weeks we accelerated months of work.</w:t>
       </w:r>
     </w:p>
     <w:p>
@@ -181,7 +181,7 @@
           <w:i w:val="0"/>
           <w:sz w:val="24"/>
         </w:rPr>
-        <w:t>My name is Josué Ramos, CEO at NUXS. Since 2010 I have been developing bot models for financial operations, with experience in Singapore, London, and Estonia. I am well-versed in data compression, and understanding clearly the context in which the bottleneck sat, I decided to act once again.</w:t>
+        <w:t>My name is Josué Ramos, CEO at NUXS. Since 2010 I have been developing bot models for financial operations, with experience in Singapore, London, and Estonia. Data compression has been part of that work for years, and once it was clear where the bottleneck sat, I decided to act on it.</w:t>
       </w:r>
     </w:p>
     <w:p>
@@ -307,7 +307,7 @@
           <w:i w:val="0"/>
           <w:sz w:val="24"/>
         </w:rPr>
-        <w:t>The unit price is indeed falling. An analysis of 2.4 billion API calls between early 2025 and early 2026 recorded a 67% drop in average cost per token. But the same period saw consumption grow thirteen-fold. Price falls in a straight line; volume grows in a curve. On the bill, the result is that companies' total AI cost is rising — not falling. Goldman Sachs projects that global token consumption will grow twenty-four-fold by 2030, driven by the adoption of agents.</w:t>
+        <w:t>The unit price is indeed falling. AI.cc’s 2026 API Infrastructure Report, analyzing 2.4 billion API calls between early 2025 and early 2026, recorded a 67% drop in average cost per token. Yet bills moved the other way: in the FinOps Foundation’s 2026 State of FinOps survey, 73% of enterprises reported AI costs above their own projections. Price falls in a straight line; volume grows in a curve. On the bill, the result is that companies’ total AI cost is rising — not falling. Goldman Sachs Research projects that global token consumption will grow twenty-four-fold by 2030, to 120 quadrillion tokens per month, driven by the adoption of agents.</w:t>
       </w:r>
     </w:p>
     <w:p>
@@ -349,7 +349,7 @@
           <w:i w:val="0"/>
           <w:sz w:val="24"/>
         </w:rPr>
-        <w:t>In our own team's real use, NUXS processed roughly 19 million tokens over 3 days. Compression removed 97% of them. In money: what would have cost $326 on a top-tier coding model cost $48 — real savings of 85%. At scale, that is the difference between an AI operation that closes the books and one that bleeds.</w:t>
+        <w:t>In an audited run through our own production hook — the same binary our team uses daily — NUXS processed 20.2 million tokens and compression removed 92% of them. In money, at top-tier coding-model input pricing, that is roughly $300 of input reduced to about $24. At scale, that is the difference between an AI operation that closes the books and one that bleeds.</w:t>
       </w:r>
     </w:p>
     <w:p>
@@ -517,7 +517,7 @@
           <w:i w:val="0"/>
           <w:sz w:val="24"/>
         </w:rPr>
-        <w:t>Over the course of development, we processed more than five hundred million tokens through capsules. Of that total, around one hundred and eighty million were audited — with raw data preserved, reproducible, hash-stamped — distributed across 9,609 samples. That is the study that accompanies this manifesto, with the entire methodology open for anyone who wants to redo the math.</w:t>
+        <w:t>Over the course of development, we have processed well over six hundred million tokens through capsules — 626.8 million of them audited, with raw data preserved, reproducible, hash-stamped. The current 200-million-token run alone spans 9,333 samples with zero errors. That is the study that accompanies this manifesto, with the entire methodology open for anyone who wants to redo the math.</w:t>
       </w:r>
     </w:p>
     <w:p>
@@ -531,7 +531,7 @@
           <w:i w:val="0"/>
           <w:sz w:val="24"/>
         </w:rPr>
-        <w:t>And here comes the most important point to read correctly: the benchmark underestimates NUXS on purpose. Most of the study was done with synthetic data — generated to be difficult, full of unique identifiers and little repetition, precisely to measure the worst case. Synthetic data compresses badly by construction. Real data is the opposite: real conversation repeats context, real logs repeat lines, real search returns overlapping material. The redundancy of reality is far greater than that of any generator.</w:t>
+        <w:t>And here is the point that matters most when reading it: the benchmark was designed to measure the worst case. The early rounds used synthetic data — generated to be difficult, full of unique identifiers and little repetition. Synthetic data compresses badly by construction. The current rounds use real-world "wild" data under digit-level mutation, precisely so that no cache or memorization can inflate the result. Real data is the opposite of synthetic: real conversation repeats context, real logs repeat lines, real search returns overlapping material. The redundancy of reality is far greater than that of any generator.</w:t>
       </w:r>
     </w:p>
     <w:p>
@@ -545,7 +545,7 @@
           <w:i w:val="0"/>
           <w:sz w:val="24"/>
         </w:rPr>
-        <w:t>The benchmark itself shows this where comparison is possible. The structural capsules, which look weak on synthetic data, climb significantly on real data: code goes from 73% to around 78%, diff from 72% to around 79%, schema from 45% to somewhere between 60% and 70%. And our team's real-world use, cited above, came in at 97%. The aggregate number of the study is therefore a floor — not a ceiling. In production, compression is higher, not lower.</w:t>
+        <w:t>The benchmark itself shows this where comparison is possible. The structural capsules, which look weak on synthetic data, climb significantly on real data: the codebase capsule goes from 77.6% on synthetic fixtures to 95.2% on real files; diff from 71% to 94.5% on real git output; schema from 45% on synthetic input to 77% on real SQL. And the audited run through our production hook, cited above, came in at 92%. The aggregate number of the study is therefore a floor — not a ceiling. In production, compression tends to run higher, not lower.</w:t>
       </w:r>
     </w:p>
     <w:p>
@@ -559,7 +559,7 @@
           <w:i w:val="0"/>
           <w:sz w:val="24"/>
         </w:rPr>
-        <w:t>The rigor of publishing the floor, not the peak, is not a weakness. It is the only honest way to make efficiency claims in a market where every claim deserves skepticism. Every compression records input, output, ratio, time, and capsule type. Every metric reconstructs from the raw data. Nothing is a black box.</w:t>
+        <w:t>The rigor of publishing the floor, not the peak, is not a weakness. It is the only way we trust to make efficiency claims in a market where every claim deserves skepticism. Every compression records input, output, ratio, time, and capsule type. Every metric reconstructs from the raw data. Nothing is a black box.</w:t>
       </w:r>
     </w:p>
     <w:p>
@@ -587,7 +587,7 @@
           <w:i w:val="0"/>
           <w:sz w:val="24"/>
         </w:rPr>
-        <w:t>There is a physical ceiling on dense data. A PDF lands around 62% because the capsule preserves every number by contract — no compression can reduce a value without deforming it, and we prefer the number intact. A schema, even in real SQL, rarely crosses 70%, because every column name is signal. And on very small input, compressing is not worth it: the product returns the input intact and records this in telemetry. We prefer honest passthrough to inflating a number.</w:t>
+        <w:t>There is a physical ceiling on dense data. A schema rarely crosses the high seventies, because every column name is signal. A PDF dense with figures keeps every number by contract — no compression may alter a value, and we prefer the number intact, even when that caps the ratio (our current measurement on a real technical PDF sits at 96%, after fixing a parser defect the protocol itself caught). And on very small input, compressing is not worth it: the product returns the input intact and records this in telemetry. We prefer honest passthrough to inflating a number.</w:t>
       </w:r>
     </w:p>
     <w:p>
@@ -700,6 +700,48 @@
           <w:sz w:val="22"/>
         </w:rPr>
         <w:t>Paul, K. (2025). Prompt Compression Techniques: Reducing Context Window Costs While Improving LLM Performance. https://medium.com/@kuldeep.paul08/prompt-compression-techniques-reducing-context-window-costs-while-improving-llm-performance-afec1e8f1003</w:t>
+      </w:r>
+    </w:p>
+    <w:p>
+      <w:pPr>
+        <w:spacing w:after="200"/>
+      </w:pPr>
+      <w:r>
+        <w:rPr>
+          <w:rFonts w:ascii="Georgia" w:hAnsi="Georgia"/>
+          <w:b w:val="0"/>
+          <w:i w:val="0"/>
+          <w:sz w:val="22"/>
+        </w:rPr>
+        <w:t>AI.cc (2026). 2026 AI API Infrastructure Report — analysis of 2.4 billion API calls across 8,000+ developers and enterprises, Jan–Apr 2026. https://ai.cc</w:t>
+      </w:r>
+    </w:p>
+    <w:p>
+      <w:pPr>
+        <w:spacing w:after="200"/>
+      </w:pPr>
+      <w:r>
+        <w:rPr>
+          <w:rFonts w:ascii="Georgia" w:hAnsi="Georgia"/>
+          <w:b w:val="0"/>
+          <w:i w:val="0"/>
+          <w:sz w:val="22"/>
+        </w:rPr>
+        <w:t>FinOps Foundation (2026). State of FinOps 2026. https://data.finops.org</w:t>
+      </w:r>
+    </w:p>
+    <w:p>
+      <w:pPr>
+        <w:spacing w:after="200"/>
+      </w:pPr>
+      <w:r>
+        <w:rPr>
+          <w:rFonts w:ascii="Georgia" w:hAnsi="Georgia"/>
+          <w:b w:val="0"/>
+          <w:i w:val="0"/>
+          <w:sz w:val="22"/>
+        </w:rPr>
+        <w:t>Goldman Sachs Research (2026). AI Agents Forecast to Boost Tech Cash Flow as Usage Soars. https://www.goldmansachs.com/insights/articles/ai-agents-forecast-to-boost-tech-cash-flow-as-usage-soars</w:t>
       </w:r>
     </w:p>
     <w:sectPr>

</xml_diff>